<commit_message>
docs(crew_planning): rev 3 — rename to "Crew Availability Engine"
Rename the custom availability service to the "Crew Availability Engine" to
avoid confusion with the rental availability engine (rental_set), and
consistently call the authoritative source "standard resource availability".
No design change; terminology only.

Co-Authored-By: Claude Opus 4.8 <noreply@anthropic.com>
Claude-Session: https://claude.ai/code/session_015UyktmijNHjiCtQB359rzX
</commit_message>
<xml_diff>
--- a/docs/crew_planning_analysis.docx
+++ b/docs/crew_planning_analysis.docx
@@ -284,7 +284,7 @@
             </w:pPr>
             <w:r>
               <w:rPr/>
-              <w:t>Analysis approved in principle — revised (rev. 2); awaiting go-ahead before development</w:t>
+              <w:t>Analysis approved in principle — revised (rev. 3); awaiting go-ahead before development</w:t>
             </w:r>
           </w:p>
         </w:tc>
@@ -329,7 +329,7 @@
             </w:pPr>
             <w:r>
               <w:rPr/>
-              <w:t>2026-09-07 (rev. 2)</w:t>
+              <w:t>2026-09-07 (rev. 3)</w:t>
             </w:r>
           </w:p>
         </w:tc>
@@ -423,6 +423,54 @@
       <w:r>
         <w:rPr/>
         <w:t xml:space="preserve"> rolling explicit-availability horizon, (6) approved Work Declarations are immutable with an explicit Reopen/adjustment workflow, (7) validated standard findings preserved.</w:t>
+      </w:r>
+    </w:p>
+    <w:p>
+      <w:pPr>
+        <w:pStyle w:val="BlockQuotation"/>
+        <w:bidi w:val="0"/>
+        <w:jc w:val="left"/>
+        <w:rPr/>
+      </w:pPr>
+      <w:r>
+        <w:rPr>
+          <w:rStyle w:val="Strong"/>
+        </w:rPr>
+        <w:t>Revision 3</w:t>
+      </w:r>
+      <w:r>
+        <w:rPr/>
+        <w:t xml:space="preserve"> renames the custom availability service to the </w:t>
+      </w:r>
+      <w:r>
+        <w:rPr>
+          <w:rStyle w:val="Strong"/>
+        </w:rPr>
+        <w:t>Crew Availability Engine</w:t>
+      </w:r>
+      <w:r>
+        <w:rPr/>
+        <w:t xml:space="preserve"> (to avoid confusion with the rental availability engine in </w:t>
+      </w:r>
+      <w:r>
+        <w:rPr>
+          <w:rStyle w:val="SourceText"/>
+        </w:rPr>
+        <w:t>rental_set</w:t>
+      </w:r>
+      <w:r>
+        <w:rPr/>
+        <w:t xml:space="preserve">) and consistently calls the authoritative source </w:t>
+      </w:r>
+      <w:r>
+        <w:rPr>
+          <w:rStyle w:val="Strong"/>
+        </w:rPr>
+        <w:t>standard resource availability</w:t>
+      </w:r>
+      <w:r>
+        <w:rPr/>
+        <w:t>.</w:t>
       </w:r>
     </w:p>
     <w:p>
@@ -1931,7 +1979,17 @@
             </w:pPr>
             <w:r>
               <w:rPr/>
-              <w:t xml:space="preserve">Small extension — mode field + service mapping declarations to </w:t>
+              <w:t xml:space="preserve">Small extension — mode field + </w:t>
+            </w:r>
+            <w:r>
+              <w:rPr>
+                <w:rStyle w:val="Strong"/>
+              </w:rPr>
+              <w:t>Crew Availability Engine</w:t>
+            </w:r>
+            <w:r>
+              <w:rPr/>
+              <w:t xml:space="preserve"> mapping declarations to </w:t>
             </w:r>
             <w:r>
               <w:rPr>
@@ -2146,7 +2204,7 @@
             </w:pPr>
             <w:r>
               <w:rPr/>
-              <w:t>Custom portal page → same leaves engine</w:t>
+              <w:t>Custom portal page → same Crew Availability Engine</w:t>
             </w:r>
           </w:p>
         </w:tc>
@@ -2345,7 +2403,7 @@
             </w:pPr>
             <w:r>
               <w:rPr/>
-              <w:t>Custom (log drives targeting; engine stays authoritative)</w:t>
+              <w:t>Custom (log drives targeting; standard resource availability stays authoritative)</w:t>
             </w:r>
           </w:p>
         </w:tc>
@@ -3622,7 +3680,101 @@
       </w:pPr>
       <w:r>
         <w:rPr/>
-        <w:t>D. Availability technical design (single source of truth)</w:t>
+        <w:t>D. Crew availability — technical design (standard resource availability stays the source of truth)</w:t>
+      </w:r>
+    </w:p>
+    <w:p>
+      <w:pPr>
+        <w:pStyle w:val="BlockQuotation"/>
+        <w:bidi w:val="0"/>
+        <w:jc w:val="left"/>
+        <w:rPr/>
+      </w:pPr>
+      <w:r>
+        <w:rPr>
+          <w:rStyle w:val="Strong"/>
+        </w:rPr>
+        <w:t>Naming:</w:t>
+      </w:r>
+      <w:r>
+        <w:rPr/>
+        <w:t xml:space="preserve"> the </w:t>
+      </w:r>
+      <w:r>
+        <w:rPr>
+          <w:rStyle w:val="Strong"/>
+        </w:rPr>
+        <w:t>Crew Availability Engine</w:t>
+      </w:r>
+      <w:r>
+        <w:rPr/>
+        <w:t xml:space="preserve"> is our thin custom service — Availability Mode handling + the </w:t>
+      </w:r>
+      <w:r>
+        <w:rPr>
+          <w:rStyle w:val="SourceText"/>
+        </w:rPr>
+        <w:t>_apply_availability(...)</w:t>
+      </w:r>
+      <w:r>
+        <w:rPr/>
+        <w:t xml:space="preserve"> leaves mapper + the mandatory horizon cron. It only </w:t>
+      </w:r>
+      <w:r>
+        <w:rPr>
+          <w:rStyle w:val="Strong"/>
+        </w:rPr>
+        <w:t xml:space="preserve">writes standard </w:t>
+      </w:r>
+      <w:r>
+        <w:rPr>
+          <w:rStyle w:val="SourceText"/>
+        </w:rPr>
+        <w:t>resource.calendar.leaves</w:t>
+      </w:r>
+      <w:r>
+        <w:rPr/>
+        <w:t xml:space="preserve">; it is </w:t>
+      </w:r>
+      <w:r>
+        <w:rPr>
+          <w:rStyle w:val="Strong"/>
+        </w:rPr>
+        <w:t>not</w:t>
+      </w:r>
+      <w:r>
+        <w:rPr/>
+        <w:t xml:space="preserve"> itself a source of availability and must not be confused with the rental availability engine (</w:t>
+      </w:r>
+      <w:r>
+        <w:rPr>
+          <w:rStyle w:val="SourceText"/>
+        </w:rPr>
+        <w:t>rental_set</w:t>
+      </w:r>
+      <w:r>
+        <w:rPr/>
+        <w:t xml:space="preserve">). The authoritative source for staffing remains </w:t>
+      </w:r>
+      <w:r>
+        <w:rPr>
+          <w:rStyle w:val="Strong"/>
+        </w:rPr>
+        <w:t>standard Odoo resource availability</w:t>
+      </w:r>
+      <w:r>
+        <w:rPr/>
+        <w:t xml:space="preserve"> (</w:t>
+      </w:r>
+      <w:r>
+        <w:rPr>
+          <w:rStyle w:val="SourceText"/>
+        </w:rPr>
+        <w:t>_work_intervals_batch</w:t>
+      </w:r>
+      <w:r>
+        <w:rPr/>
+        <w:t>).</w:t>
       </w:r>
     </w:p>
     <w:p>
@@ -3714,7 +3866,7 @@
       </w:r>
       <w:r>
         <w:rPr/>
-        <w:t xml:space="preserve"> (a business/HR decision); the availability service reaches the engine via </w:t>
+        <w:t xml:space="preserve"> (a business/HR decision); the Crew Availability Engine reaches standard resource availability via </w:t>
       </w:r>
       <w:r>
         <w:rPr>
@@ -3965,7 +4117,7 @@
       </w:r>
       <w:r>
         <w:rPr/>
-        <w:t>, never whom the engine considers available.</w:t>
+        <w:t>, never whom standard resource availability considers available.</w:t>
       </w:r>
     </w:p>
     <w:p>
@@ -4065,7 +4217,7 @@
       </w:r>
       <w:r>
         <w:rPr/>
-        <w:t xml:space="preserve"> works with the standard engine (</w:t>
+        <w:t xml:space="preserve"> works with standard resource availability (</w:t>
       </w:r>
       <w:r>
         <w:rPr>
@@ -4097,7 +4249,17 @@
       </w:pPr>
       <w:r>
         <w:rPr/>
-        <w:t xml:space="preserve">A single idempotent service </w:t>
+        <w:t xml:space="preserve">The </w:t>
+      </w:r>
+      <w:r>
+        <w:rPr>
+          <w:rStyle w:val="Strong"/>
+        </w:rPr>
+        <w:t>Crew Availability Engine</w:t>
+      </w:r>
+      <w:r>
+        <w:rPr/>
+        <w:t xml:space="preserve"> — a single idempotent service </w:t>
       </w:r>
       <w:r>
         <w:rPr>
@@ -4107,7 +4269,7 @@
       </w:r>
       <w:r>
         <w:rPr/>
-        <w:t xml:space="preserve"> owns all leave create/split/merge: store </w:t>
+        <w:t xml:space="preserve"> — owns all leave create/split/merge: store </w:t>
       </w:r>
       <w:r>
         <w:rPr>
@@ -4147,7 +4309,17 @@
       </w:r>
       <w:r>
         <w:rPr/>
-        <w:t xml:space="preserve"> fold/gap explicitly, normalise overlaps to non-overlapping intervals before writing. </w:t>
+        <w:t xml:space="preserve"> fold/gap explicitly, normalise overlaps to non-overlapping intervals before writing. It only ever writes standard </w:t>
+      </w:r>
+      <w:r>
+        <w:rPr>
+          <w:rStyle w:val="SourceText"/>
+        </w:rPr>
+        <w:t>resource.calendar.leaves</w:t>
+      </w:r>
+      <w:r>
+        <w:rPr/>
+        <w:t xml:space="preserve">; it computes no availability of its own. </w:t>
       </w:r>
       <w:r>
         <w:rPr>
@@ -4324,7 +4496,7 @@
       </w:r>
       <w:r>
         <w:rPr/>
-        <w:t xml:space="preserve"> and must never become a parallel availability engine. </w:t>
+        <w:t xml:space="preserve"> and must never become a parallel availability source. </w:t>
       </w:r>
     </w:p>
     <w:p>
@@ -4336,7 +4508,7 @@
       </w:pPr>
       <w:r>
         <w:rPr/>
-        <w:t xml:space="preserve">The engine cannot distinguish </w:t>
+        <w:t xml:space="preserve">Standard resource availability cannot distinguish </w:t>
       </w:r>
       <w:r>
         <w:rPr>
@@ -4356,7 +4528,7 @@
       </w:r>
       <w:r>
         <w:rPr/>
-        <w:t xml:space="preserve"> (both are "leave"). That distinction lives in </w:t>
+        <w:t xml:space="preserve"> (both are a "leave"). That distinction lives in </w:t>
       </w:r>
       <w:r>
         <w:rPr>
@@ -4366,7 +4538,7 @@
       </w:r>
       <w:r>
         <w:rPr/>
-        <w:t>, which drives §6 "don't re-ask" — not the engine.</w:t>
+        <w:t>, which drives §6 "don't re-ask" — never in operational availability.</w:t>
       </w:r>
     </w:p>
     <w:p>
@@ -4887,7 +5059,7 @@
         <w:rPr>
           <w:rStyle w:val="Strong"/>
         </w:rPr>
-        <w:t>no parallel engine.</w:t>
+        <w:t>no parallel availability source.</w:t>
       </w:r>
     </w:p>
     <w:p>
@@ -7300,7 +7472,7 @@
       </w:r>
       <w:r>
         <w:rPr/>
-        <w:t xml:space="preserve"> (backend core): availability leaves service (both modes) + mandatory horizon cron, audit log, requests, invitations, transient candidate wizard, work declaration, </w:t>
+        <w:t xml:space="preserve"> (backend core): the Crew Availability Engine (both modes) + mandatory horizon cron, audit log, requests, invitations, transient candidate wizard, work declaration, </w:t>
       </w:r>
       <w:r>
         <w:rPr>
@@ -7607,7 +7779,7 @@
         <w:rPr>
           <w:rStyle w:val="Strong"/>
         </w:rPr>
-        <w:t>Phase 1 — Availability engine:</w:t>
+        <w:t>Phase 1 — Crew Availability Engine:</w:t>
       </w:r>
       <w:r>
         <w:rPr/>

</xml_diff>